<commit_message>
Added more detail to the project plan
</commit_message>
<xml_diff>
--- a/Project Plan.docx
+++ b/Project Plan.docx
@@ -485,6 +485,15 @@
     </w:p>
     <w:sdt>
       <w:sdtPr>
+        <w:rPr>
+          <w:rFonts w:asciiTheme="minorHAnsi" w:eastAsiaTheme="minorHAnsi" w:hAnsiTheme="minorHAnsi" w:cstheme="minorBidi"/>
+          <w:color w:val="auto"/>
+          <w:kern w:val="2"/>
+          <w:sz w:val="22"/>
+          <w:szCs w:val="22"/>
+          <w:lang w:val="en-IE"/>
+          <w14:ligatures w14:val="standardContextual"/>
+        </w:rPr>
         <w:id w:val="-673341294"/>
         <w:docPartObj>
           <w:docPartGallery w:val="Table of Contents"/>
@@ -493,16 +502,9 @@
       </w:sdtPr>
       <w:sdtEndPr>
         <w:rPr>
-          <w:rFonts w:asciiTheme="minorHAnsi" w:eastAsiaTheme="minorHAnsi" w:hAnsiTheme="minorHAnsi" w:cstheme="minorBidi"/>
           <w:b/>
           <w:bCs/>
           <w:noProof/>
-          <w:color w:val="auto"/>
-          <w:kern w:val="2"/>
-          <w:sz w:val="22"/>
-          <w:szCs w:val="22"/>
-          <w:lang w:val="en-IE"/>
-          <w14:ligatures w14:val="standardContextual"/>
         </w:rPr>
       </w:sdtEndPr>
       <w:sdtContent>
@@ -911,6 +913,156 @@
       </w:r>
       <w:r>
         <w:t xml:space="preserve"> </w:t>
+      </w:r>
+    </w:p>
+    <w:p>
+      <w:pPr>
+        <w:pStyle w:val="Heading3"/>
+      </w:pPr>
+      <w:r>
+        <w:t>Task 1: Power Stage Circuit Simulation</w:t>
+      </w:r>
+    </w:p>
+    <w:p/>
+    <w:p>
+      <w:pPr>
+        <w:pStyle w:val="Heading3"/>
+      </w:pPr>
+      <w:r>
+        <w:t>Task 2: Power Electronics Part Selection</w:t>
+      </w:r>
+    </w:p>
+    <w:p/>
+    <w:p>
+      <w:pPr>
+        <w:pStyle w:val="Heading3"/>
+      </w:pPr>
+      <w:r>
+        <w:t>Task 3: Schematic Design</w:t>
+      </w:r>
+    </w:p>
+    <w:p/>
+    <w:p>
+      <w:pPr>
+        <w:pStyle w:val="Heading3"/>
+      </w:pPr>
+      <w:r>
+        <w:t>Task 4: Layout Design</w:t>
+      </w:r>
+    </w:p>
+    <w:p/>
+    <w:p>
+      <w:pPr>
+        <w:pStyle w:val="Heading2"/>
+      </w:pPr>
+      <w:r>
+        <w:t>WP3: Control Electronics Design</w:t>
+      </w:r>
+    </w:p>
+    <w:p>
+      <w:pPr>
+        <w:pStyle w:val="Heading3"/>
+      </w:pPr>
+      <w:r>
+        <w:t>Task 1: Control Scheme Comparison</w:t>
+      </w:r>
+    </w:p>
+    <w:p/>
+    <w:p>
+      <w:pPr>
+        <w:pStyle w:val="Heading3"/>
+      </w:pPr>
+      <w:r>
+        <w:t>Task 2: Hardware Control Simulation</w:t>
+      </w:r>
+    </w:p>
+    <w:p/>
+    <w:p>
+      <w:pPr>
+        <w:pStyle w:val="Heading3"/>
+      </w:pPr>
+      <w:r>
+        <w:t>Task 3: Control Electronics Schematic</w:t>
+      </w:r>
+    </w:p>
+    <w:p/>
+    <w:p>
+      <w:pPr>
+        <w:pStyle w:val="Heading3"/>
+      </w:pPr>
+      <w:r>
+        <w:lastRenderedPageBreak/>
+        <w:t>Task 4: Control Electronics Layout</w:t>
+      </w:r>
+    </w:p>
+    <w:p/>
+    <w:p>
+      <w:pPr>
+        <w:pStyle w:val="Heading2"/>
+      </w:pPr>
+      <w:r>
+        <w:t>WP4: Electrical Verification</w:t>
+      </w:r>
+    </w:p>
+    <w:p>
+      <w:pPr>
+        <w:pStyle w:val="Heading3"/>
+      </w:pPr>
+      <w:r>
+        <w:t>Open Loop Power Electronic Testing</w:t>
+      </w:r>
+    </w:p>
+    <w:p/>
+    <w:p>
+      <w:pPr>
+        <w:pStyle w:val="Heading3"/>
+      </w:pPr>
+      <w:r>
+        <w:t>Power Controller Testing</w:t>
+      </w:r>
+    </w:p>
+    <w:p/>
+    <w:p>
+      <w:pPr>
+        <w:pStyle w:val="Heading3"/>
+      </w:pPr>
+      <w:r>
+        <w:t>Closed Loop Motor Control</w:t>
+      </w:r>
+    </w:p>
+    <w:p/>
+    <w:p>
+      <w:pPr>
+        <w:pStyle w:val="Heading3"/>
+      </w:pPr>
+      <w:r>
+        <w:t>Verification on Mini Dynamometer</w:t>
+      </w:r>
+    </w:p>
+    <w:p/>
+    <w:p>
+      <w:pPr>
+        <w:pStyle w:val="Heading2"/>
+      </w:pPr>
+      <w:r>
+        <w:t>WP5: Implementation on the Geec</w:t>
+      </w:r>
+    </w:p>
+    <w:p>
+      <w:pPr>
+        <w:pStyle w:val="Heading3"/>
+      </w:pPr>
+      <w:r>
+        <w:t>Convert current power electronics system to new system</w:t>
+      </w:r>
+    </w:p>
+    <w:p/>
+    <w:p>
+      <w:pPr>
+        <w:pStyle w:val="Heading3"/>
+      </w:pPr>
+      <w:r>
+        <w:t>Measure performance improvements</w:t>
       </w:r>
     </w:p>
     <w:sectPr>

</xml_diff>

<commit_message>
Update project plan with detailed tasks and risk management strategies
</commit_message>
<xml_diff>
--- a/Project Plan.docx
+++ b/Project Plan.docx
@@ -443,16 +443,10 @@
             <w:cnfStyle w:val="001000000000" w:firstRow="0" w:lastRow="0" w:firstColumn="1" w:lastColumn="0" w:oddVBand="0" w:evenVBand="0" w:oddHBand="0" w:evenHBand="0" w:firstRowFirstColumn="0" w:firstRowLastColumn="0" w:lastRowFirstColumn="0" w:lastRowLastColumn="0"/>
             <w:tcW w:w="1701" w:type="dxa"/>
           </w:tcPr>
-          <w:p/>
-        </w:tc>
-        <w:tc>
-          <w:tcPr>
-            <w:tcW w:w="1276" w:type="dxa"/>
-          </w:tcPr>
           <w:p>
-            <w:pPr>
-              <w:cnfStyle w:val="000000000000" w:firstRow="0" w:lastRow="0" w:firstColumn="0" w:lastColumn="0" w:oddVBand="0" w:evenVBand="0" w:oddHBand="0" w:evenHBand="0" w:firstRowFirstColumn="0" w:firstRowLastColumn="0" w:lastRowFirstColumn="0" w:lastRowLastColumn="0"/>
-            </w:pPr>
+            <w:r>
+              <w:t>SEM Organiser</w:t>
+            </w:r>
           </w:p>
         </w:tc>
         <w:tc>
@@ -463,6 +457,22 @@
             <w:pPr>
               <w:cnfStyle w:val="000000000000" w:firstRow="0" w:lastRow="0" w:firstColumn="0" w:lastColumn="0" w:oddVBand="0" w:evenVBand="0" w:oddHBand="0" w:evenHBand="0" w:firstRowFirstColumn="0" w:firstRowLastColumn="0" w:lastRowFirstColumn="0" w:lastRowLastColumn="0"/>
             </w:pPr>
+            <w:r>
+              <w:t>High</w:t>
+            </w:r>
+          </w:p>
+        </w:tc>
+        <w:tc>
+          <w:tcPr>
+            <w:tcW w:w="1276" w:type="dxa"/>
+          </w:tcPr>
+          <w:p>
+            <w:pPr>
+              <w:cnfStyle w:val="000000000000" w:firstRow="0" w:lastRow="0" w:firstColumn="0" w:lastColumn="0" w:oddVBand="0" w:evenVBand="0" w:oddHBand="0" w:evenHBand="0" w:firstRowFirstColumn="0" w:firstRowLastColumn="0" w:lastRowFirstColumn="0" w:lastRowLastColumn="0"/>
+            </w:pPr>
+            <w:r>
+              <w:t>High</w:t>
+            </w:r>
           </w:p>
         </w:tc>
         <w:tc>
@@ -473,6 +483,9 @@
             <w:pPr>
               <w:cnfStyle w:val="000000000000" w:firstRow="0" w:lastRow="0" w:firstColumn="0" w:lastColumn="0" w:oddVBand="0" w:evenVBand="0" w:oddHBand="0" w:evenHBand="0" w:firstRowFirstColumn="0" w:firstRowLastColumn="0" w:lastRowFirstColumn="0" w:lastRowLastColumn="0"/>
             </w:pPr>
+            <w:r>
+              <w:t>Design is compliant with the rules as written by SEMD</w:t>
+            </w:r>
           </w:p>
         </w:tc>
       </w:tr>
@@ -872,15 +885,7 @@
         </w:numPr>
       </w:pPr>
       <w:r>
-        <w:t>Rory Egan’s thesis last year investigated the use of a BLDC motor, suggesting that there is much greater performance to be achieved using BLDC. Compare using existing data and manufacturer specifications the energy requirements.</w:t>
-      </w:r>
-    </w:p>
-    <w:p>
-      <w:pPr>
-        <w:pStyle w:val="Heading3"/>
-      </w:pPr>
-      <w:r>
-        <w:t>Investigate the Current Power Electronics Design</w:t>
+        <w:t xml:space="preserve">Rory Egan’s thesis last year investigated the use of a BLDC motor, suggesting that there is much greater performance to be achieved using BLDC. </w:t>
       </w:r>
     </w:p>
     <w:p>
@@ -891,28 +896,264 @@
           <w:numId w:val="5"/>
         </w:numPr>
       </w:pPr>
+      <w:r>
+        <w:t>Investigate high efficiency BLDC motors in the 100-1000W range.</w:t>
+      </w:r>
+    </w:p>
+    <w:p>
+      <w:pPr>
+        <w:pStyle w:val="ListParagraph"/>
+        <w:numPr>
+          <w:ilvl w:val="0"/>
+          <w:numId w:val="5"/>
+        </w:numPr>
+      </w:pPr>
+      <w:r>
+        <w:t>Compare using existing data and manufacturer specifications the energy requirements.</w:t>
+      </w:r>
     </w:p>
     <w:p>
       <w:pPr>
         <w:pStyle w:val="Heading3"/>
       </w:pPr>
       <w:r>
+        <w:t>Investigate the Current Power Electronics Design</w:t>
+      </w:r>
+    </w:p>
+    <w:p>
+      <w:pPr>
+        <w:pStyle w:val="ListParagraph"/>
+        <w:numPr>
+          <w:ilvl w:val="0"/>
+          <w:numId w:val="5"/>
+        </w:numPr>
+      </w:pPr>
+      <w:r>
+        <w:t>Evaluate the parts and layout of the current power electronics</w:t>
+      </w:r>
+      <w:r>
+        <w:t>.</w:t>
+      </w:r>
+    </w:p>
+    <w:p>
+      <w:pPr>
+        <w:pStyle w:val="ListParagraph"/>
+        <w:numPr>
+          <w:ilvl w:val="0"/>
+          <w:numId w:val="5"/>
+        </w:numPr>
+      </w:pPr>
+      <w:r>
+        <w:t>Identify the capabilities and limitations involved in the current design</w:t>
+      </w:r>
+      <w:r>
+        <w:t>.</w:t>
+      </w:r>
+    </w:p>
+    <w:p>
+      <w:pPr>
+        <w:pStyle w:val="ListParagraph"/>
+        <w:numPr>
+          <w:ilvl w:val="0"/>
+          <w:numId w:val="5"/>
+        </w:numPr>
+      </w:pPr>
+      <w:r>
+        <w:t>Simulate the current design</w:t>
+      </w:r>
+      <w:r>
+        <w:t>.</w:t>
+      </w:r>
+    </w:p>
+    <w:p>
+      <w:pPr>
+        <w:pStyle w:val="Heading3"/>
+      </w:pPr>
+      <w:r>
         <w:t>Research different methods</w:t>
       </w:r>
       <w:r>
         <w:t xml:space="preserve"> of control, power etc.</w:t>
       </w:r>
     </w:p>
+    <w:p>
+      <w:pPr>
+        <w:pStyle w:val="ListParagraph"/>
+        <w:numPr>
+          <w:ilvl w:val="0"/>
+          <w:numId w:val="5"/>
+        </w:numPr>
+      </w:pPr>
+      <w:r>
+        <w:t xml:space="preserve">Investigate the newer power MOSFETs, Gate Drivers, HEMTs and </w:t>
+      </w:r>
+      <w:r>
+        <w:t>sensors</w:t>
+      </w:r>
+      <w:r>
+        <w:t>.</w:t>
+      </w:r>
+    </w:p>
+    <w:p>
+      <w:pPr>
+        <w:pStyle w:val="ListParagraph"/>
+        <w:numPr>
+          <w:ilvl w:val="0"/>
+          <w:numId w:val="5"/>
+        </w:numPr>
+      </w:pPr>
+      <w:r>
+        <w:t>Investigate different control strategies, open loop, hardware vs software closed loop</w:t>
+      </w:r>
+      <w:r>
+        <w:t>.</w:t>
+      </w:r>
+    </w:p>
+    <w:p>
+      <w:pPr>
+        <w:pStyle w:val="ListParagraph"/>
+        <w:numPr>
+          <w:ilvl w:val="0"/>
+          <w:numId w:val="5"/>
+        </w:numPr>
+      </w:pPr>
+      <w:r>
+        <w:t xml:space="preserve">Investigate connectors </w:t>
+      </w:r>
+      <w:r>
+        <w:t>separate solutions.</w:t>
+      </w:r>
+    </w:p>
+    <w:p>
+      <w:pPr>
+        <w:pStyle w:val="Heading2"/>
+      </w:pPr>
+      <w:r>
+        <w:t>WP2: Power Electronics Design</w:t>
+      </w:r>
+      <w:r>
+        <w:t xml:space="preserve"> </w:t>
+      </w:r>
+    </w:p>
+    <w:p>
+      <w:pPr>
+        <w:pStyle w:val="Heading3"/>
+      </w:pPr>
+      <w:r>
+        <w:t>Task 1: Power Stage Circuit Simulation</w:t>
+      </w:r>
+    </w:p>
+    <w:p>
+      <w:pPr>
+        <w:pStyle w:val="ListParagraph"/>
+        <w:numPr>
+          <w:ilvl w:val="0"/>
+          <w:numId w:val="5"/>
+        </w:numPr>
+      </w:pPr>
+      <w:r>
+        <w:t>Create an accurate  simulation of the new power electronics</w:t>
+      </w:r>
+      <w:r>
+        <w:t>.</w:t>
+      </w:r>
+    </w:p>
+    <w:p>
+      <w:pPr>
+        <w:pStyle w:val="ListParagraph"/>
+        <w:numPr>
+          <w:ilvl w:val="0"/>
+          <w:numId w:val="5"/>
+        </w:numPr>
+      </w:pPr>
+      <w:r>
+        <w:t>Determine the power consumption</w:t>
+      </w:r>
+      <w:r>
+        <w:t xml:space="preserve">  during switching events.</w:t>
+      </w:r>
+    </w:p>
+    <w:p>
+      <w:pPr>
+        <w:pStyle w:val="ListParagraph"/>
+        <w:numPr>
+          <w:ilvl w:val="0"/>
+          <w:numId w:val="5"/>
+        </w:numPr>
+      </w:pPr>
+      <w:r>
+        <w:t xml:space="preserve">Evaluate </w:t>
+      </w:r>
+      <w:r>
+        <w:t>current ripple due to different switching frequencies</w:t>
+      </w:r>
+    </w:p>
+    <w:p>
+      <w:pPr>
+        <w:pStyle w:val="Heading3"/>
+      </w:pPr>
+      <w:r>
+        <w:t>Task 2: Power Electronics Part Selection</w:t>
+      </w:r>
+    </w:p>
+    <w:p>
+      <w:pPr>
+        <w:pStyle w:val="ListParagraph"/>
+        <w:numPr>
+          <w:ilvl w:val="0"/>
+          <w:numId w:val="5"/>
+        </w:numPr>
+      </w:pPr>
+      <w:r>
+        <w:t>Select and Simulate other electrical parts. Current sensors, voltage sensors, combinations of capacitors (electrolytic, ceramic, Film, MLCC)</w:t>
+      </w:r>
+    </w:p>
+    <w:p>
+      <w:pPr>
+        <w:pStyle w:val="ListParagraph"/>
+        <w:numPr>
+          <w:ilvl w:val="0"/>
+          <w:numId w:val="5"/>
+        </w:numPr>
+      </w:pPr>
+      <w:r>
+        <w:t>Create a block diagram and of parts on each board</w:t>
+      </w:r>
+    </w:p>
+    <w:p>
+      <w:pPr>
+        <w:pStyle w:val="ListParagraph"/>
+        <w:numPr>
+          <w:ilvl w:val="0"/>
+          <w:numId w:val="5"/>
+        </w:numPr>
+      </w:pPr>
+    </w:p>
+    <w:p>
+      <w:pPr>
+        <w:pStyle w:val="Heading3"/>
+      </w:pPr>
+      <w:r>
+        <w:t>Task 3: Schematic Design</w:t>
+      </w:r>
+    </w:p>
     <w:p/>
     <w:p>
       <w:pPr>
+        <w:pStyle w:val="Heading3"/>
+      </w:pPr>
+      <w:r>
+        <w:lastRenderedPageBreak/>
+        <w:t>Task 4: Layout Design</w:t>
+      </w:r>
+    </w:p>
+    <w:p/>
+    <w:p>
+      <w:pPr>
         <w:pStyle w:val="Heading2"/>
       </w:pPr>
       <w:r>
-        <w:t>WP2: Power Electronics Design</w:t>
-      </w:r>
-      <w:r>
-        <w:t xml:space="preserve"> </w:t>
+        <w:t>WP3: Control Electronics Design</w:t>
       </w:r>
     </w:p>
     <w:p>
@@ -920,7 +1161,7 @@
         <w:pStyle w:val="Heading3"/>
       </w:pPr>
       <w:r>
-        <w:t>Task 1: Power Stage Circuit Simulation</w:t>
+        <w:t>Task 1: Control Scheme Comparison</w:t>
       </w:r>
     </w:p>
     <w:p/>
@@ -929,7 +1170,7 @@
         <w:pStyle w:val="Heading3"/>
       </w:pPr>
       <w:r>
-        <w:t>Task 2: Power Electronics Part Selection</w:t>
+        <w:t>Task 2: Hardware Control Simulation</w:t>
       </w:r>
     </w:p>
     <w:p/>
@@ -938,7 +1179,7 @@
         <w:pStyle w:val="Heading3"/>
       </w:pPr>
       <w:r>
-        <w:t>Task 3: Schematic Design</w:t>
+        <w:t>Task 3: Control Electronics Schematic</w:t>
       </w:r>
     </w:p>
     <w:p/>
@@ -947,7 +1188,7 @@
         <w:pStyle w:val="Heading3"/>
       </w:pPr>
       <w:r>
-        <w:t>Task 4: Layout Design</w:t>
+        <w:t>Task 4: Control Electronics Layout</w:t>
       </w:r>
     </w:p>
     <w:p/>
@@ -956,7 +1197,7 @@
         <w:pStyle w:val="Heading2"/>
       </w:pPr>
       <w:r>
-        <w:t>WP3: Control Electronics Design</w:t>
+        <w:t>WP4: Electrical Verification</w:t>
       </w:r>
     </w:p>
     <w:p>
@@ -964,7 +1205,7 @@
         <w:pStyle w:val="Heading3"/>
       </w:pPr>
       <w:r>
-        <w:t>Task 1: Control Scheme Comparison</w:t>
+        <w:t>Open Loop Power Electronic Testing</w:t>
       </w:r>
     </w:p>
     <w:p/>
@@ -973,7 +1214,7 @@
         <w:pStyle w:val="Heading3"/>
       </w:pPr>
       <w:r>
-        <w:t>Task 2: Hardware Control Simulation</w:t>
+        <w:t>Power Controller Testing</w:t>
       </w:r>
     </w:p>
     <w:p/>
@@ -982,7 +1223,7 @@
         <w:pStyle w:val="Heading3"/>
       </w:pPr>
       <w:r>
-        <w:t>Task 3: Control Electronics Schematic</w:t>
+        <w:t>Closed Loop Motor Control</w:t>
       </w:r>
     </w:p>
     <w:p/>
@@ -991,80 +1232,93 @@
         <w:pStyle w:val="Heading3"/>
       </w:pPr>
       <w:r>
+        <w:t>Verification on Mini Dynamometer</w:t>
+      </w:r>
+    </w:p>
+    <w:p/>
+    <w:p>
+      <w:pPr>
+        <w:pStyle w:val="Heading2"/>
+      </w:pPr>
+      <w:r>
+        <w:t>WP5: Implementation on the Geec</w:t>
+      </w:r>
+    </w:p>
+    <w:p>
+      <w:pPr>
+        <w:pStyle w:val="Heading3"/>
+      </w:pPr>
+      <w:r>
+        <w:t>Convert current power electronics system to new system</w:t>
+      </w:r>
+    </w:p>
+    <w:p/>
+    <w:p>
+      <w:pPr>
+        <w:pStyle w:val="Heading3"/>
+      </w:pPr>
+      <w:r>
+        <w:t>Measure performance improvements</w:t>
+      </w:r>
+    </w:p>
+    <w:p>
+      <w:pPr>
+        <w:rPr>
+          <w:rFonts w:asciiTheme="majorHAnsi" w:eastAsiaTheme="majorEastAsia" w:hAnsiTheme="majorHAnsi" w:cstheme="majorBidi"/>
+          <w:sz w:val="24"/>
+          <w:szCs w:val="24"/>
+        </w:rPr>
+      </w:pPr>
+      <w:r>
+        <w:br w:type="page"/>
+      </w:r>
+    </w:p>
+    <w:p>
+      <w:pPr>
+        <w:pStyle w:val="Heading1"/>
+      </w:pPr>
+      <w:r>
         <w:lastRenderedPageBreak/>
-        <w:t>Task 4: Control Electronics Layout</w:t>
+        <w:t>Work Schedule</w:t>
+      </w:r>
+    </w:p>
+    <w:p>
+      <w:pPr>
+        <w:rPr>
+          <w:rFonts w:asciiTheme="majorHAnsi" w:eastAsiaTheme="majorEastAsia" w:hAnsiTheme="majorHAnsi" w:cstheme="majorBidi"/>
+          <w:b/>
+          <w:sz w:val="32"/>
+          <w:szCs w:val="32"/>
+        </w:rPr>
+      </w:pPr>
+      <w:r>
+        <w:br w:type="page"/>
+      </w:r>
+    </w:p>
+    <w:p>
+      <w:pPr>
+        <w:pStyle w:val="Heading1"/>
+      </w:pPr>
+      <w:r>
+        <w:lastRenderedPageBreak/>
+        <w:t>Risk Register</w:t>
+      </w:r>
+    </w:p>
+    <w:p>
+      <w:r>
+        <w:br w:type="page"/>
+      </w:r>
+    </w:p>
+    <w:p>
+      <w:pPr>
+        <w:pStyle w:val="Heading1"/>
+      </w:pPr>
+      <w:r>
+        <w:lastRenderedPageBreak/>
+        <w:t>Communication Strategy</w:t>
       </w:r>
     </w:p>
     <w:p/>
-    <w:p>
-      <w:pPr>
-        <w:pStyle w:val="Heading2"/>
-      </w:pPr>
-      <w:r>
-        <w:t>WP4: Electrical Verification</w:t>
-      </w:r>
-    </w:p>
-    <w:p>
-      <w:pPr>
-        <w:pStyle w:val="Heading3"/>
-      </w:pPr>
-      <w:r>
-        <w:t>Open Loop Power Electronic Testing</w:t>
-      </w:r>
-    </w:p>
-    <w:p/>
-    <w:p>
-      <w:pPr>
-        <w:pStyle w:val="Heading3"/>
-      </w:pPr>
-      <w:r>
-        <w:t>Power Controller Testing</w:t>
-      </w:r>
-    </w:p>
-    <w:p/>
-    <w:p>
-      <w:pPr>
-        <w:pStyle w:val="Heading3"/>
-      </w:pPr>
-      <w:r>
-        <w:t>Closed Loop Motor Control</w:t>
-      </w:r>
-    </w:p>
-    <w:p/>
-    <w:p>
-      <w:pPr>
-        <w:pStyle w:val="Heading3"/>
-      </w:pPr>
-      <w:r>
-        <w:t>Verification on Mini Dynamometer</w:t>
-      </w:r>
-    </w:p>
-    <w:p/>
-    <w:p>
-      <w:pPr>
-        <w:pStyle w:val="Heading2"/>
-      </w:pPr>
-      <w:r>
-        <w:t>WP5: Implementation on the Geec</w:t>
-      </w:r>
-    </w:p>
-    <w:p>
-      <w:pPr>
-        <w:pStyle w:val="Heading3"/>
-      </w:pPr>
-      <w:r>
-        <w:t>Convert current power electronics system to new system</w:t>
-      </w:r>
-    </w:p>
-    <w:p/>
-    <w:p>
-      <w:pPr>
-        <w:pStyle w:val="Heading3"/>
-      </w:pPr>
-      <w:r>
-        <w:t>Measure performance improvements</w:t>
-      </w:r>
-    </w:p>
     <w:sectPr>
       <w:pgSz w:w="11906" w:h="16838"/>
       <w:pgMar w:top="1440" w:right="1440" w:bottom="1440" w:left="1440" w:header="708" w:footer="708" w:gutter="0"/>

</xml_diff>